<commit_message>
fix: add xmlns:w10 namespace declaration to Ftr, Hdr, Endnotes, Footnotes serializers
Word rejected exported .docx files because these XML parts contained
w10:paraId attributes but lacked the xmlns:w10 namespace declaration on
their root elements. Document.go and Comments.go already declared it;
this brings Ftr, Hdr, Endnotes and Footnotes into alignment.

Golden test files regenerated to include the new namespace attribute.
</commit_message>
<xml_diff>
--- a/document/testdata/header-footer-multiple.docx
+++ b/document/testdata/header-footer-multiple.docx
@@ -68,7 +68,7 @@
 </file>
 
 <file path=word/header1.xml><?xml version="1.0" encoding="utf-8"?>
-<w:hdr xmlns="http://schemas.openxmlformats.org/wordprocessingml/2006/main" xmlns:a="http://schemas.openxmlformats.org/drawingml/2006/main" xmlns:m="http://schemas.openxmlformats.org/officeDocument/2006/math" xmlns:ma="http://schemas.openxmlformats.org/schemaLibrary/2006/main" xmlns:pic="http://schemas.openxmlformats.org/drawingml/2006/picture" xmlns:r="http://schemas.openxmlformats.org/officeDocument/2006/relationships" xmlns:s="http://schemas.openxmlformats.org/officeDocument/2006/sharedTypes" xmlns:w="http://schemas.openxmlformats.org/wordprocessingml/2006/main" xmlns:wp="http://schemas.openxmlformats.org/drawingml/2006/wordprocessingDrawing" xmlns:xml="http://www.w3.org/XML/1998/namespace">
+<w:hdr xmlns="http://schemas.openxmlformats.org/wordprocessingml/2006/main" xmlns:a="http://schemas.openxmlformats.org/drawingml/2006/main" xmlns:m="http://schemas.openxmlformats.org/officeDocument/2006/math" xmlns:ma="http://schemas.openxmlformats.org/schemaLibrary/2006/main" xmlns:pic="http://schemas.openxmlformats.org/drawingml/2006/picture" xmlns:r="http://schemas.openxmlformats.org/officeDocument/2006/relationships" xmlns:s="http://schemas.openxmlformats.org/officeDocument/2006/sharedTypes" xmlns:w="http://schemas.openxmlformats.org/wordprocessingml/2006/main" xmlns:wp="http://schemas.openxmlformats.org/drawingml/2006/wordprocessingDrawing" xmlns:xml="http://www.w3.org/XML/1998/namespace" xmlns:w10="http://schemas.microsoft.com/office/word/2010/wordml">
   <w:p>
     <w:pPr>
       <w:tabs>
@@ -84,7 +84,7 @@
 </file>
 
 <file path=word/header2.xml><?xml version="1.0" encoding="utf-8"?>
-<w:hdr xmlns="http://schemas.openxmlformats.org/wordprocessingml/2006/main" xmlns:a="http://schemas.openxmlformats.org/drawingml/2006/main" xmlns:m="http://schemas.openxmlformats.org/officeDocument/2006/math" xmlns:ma="http://schemas.openxmlformats.org/schemaLibrary/2006/main" xmlns:pic="http://schemas.openxmlformats.org/drawingml/2006/picture" xmlns:r="http://schemas.openxmlformats.org/officeDocument/2006/relationships" xmlns:s="http://schemas.openxmlformats.org/officeDocument/2006/sharedTypes" xmlns:w="http://schemas.openxmlformats.org/wordprocessingml/2006/main" xmlns:wp="http://schemas.openxmlformats.org/drawingml/2006/wordprocessingDrawing" xmlns:xml="http://www.w3.org/XML/1998/namespace">
+<w:hdr xmlns="http://schemas.openxmlformats.org/wordprocessingml/2006/main" xmlns:a="http://schemas.openxmlformats.org/drawingml/2006/main" xmlns:m="http://schemas.openxmlformats.org/officeDocument/2006/math" xmlns:ma="http://schemas.openxmlformats.org/schemaLibrary/2006/main" xmlns:pic="http://schemas.openxmlformats.org/drawingml/2006/picture" xmlns:r="http://schemas.openxmlformats.org/officeDocument/2006/relationships" xmlns:s="http://schemas.openxmlformats.org/officeDocument/2006/sharedTypes" xmlns:w="http://schemas.openxmlformats.org/wordprocessingml/2006/main" xmlns:wp="http://schemas.openxmlformats.org/drawingml/2006/wordprocessingDrawing" xmlns:xml="http://www.w3.org/XML/1998/namespace" xmlns:w10="http://schemas.microsoft.com/office/word/2010/wordml">
   <w:p>
     <w:pPr>
       <w:tabs>

</xml_diff>

<commit_message>
Revert "fix: add xmlns:w10 namespace declaration to Ftr, Hdr, Endnotes, Footnotes serializers"
This reverts commit 0b91ff15ec5fb59b3b5095c32e7e7d6e31a91ebc.
</commit_message>
<xml_diff>
--- a/document/testdata/header-footer-multiple.docx
+++ b/document/testdata/header-footer-multiple.docx
@@ -68,7 +68,7 @@
 </file>
 
 <file path=word/header1.xml><?xml version="1.0" encoding="utf-8"?>
-<w:hdr xmlns="http://schemas.openxmlformats.org/wordprocessingml/2006/main" xmlns:a="http://schemas.openxmlformats.org/drawingml/2006/main" xmlns:m="http://schemas.openxmlformats.org/officeDocument/2006/math" xmlns:ma="http://schemas.openxmlformats.org/schemaLibrary/2006/main" xmlns:pic="http://schemas.openxmlformats.org/drawingml/2006/picture" xmlns:r="http://schemas.openxmlformats.org/officeDocument/2006/relationships" xmlns:s="http://schemas.openxmlformats.org/officeDocument/2006/sharedTypes" xmlns:w="http://schemas.openxmlformats.org/wordprocessingml/2006/main" xmlns:wp="http://schemas.openxmlformats.org/drawingml/2006/wordprocessingDrawing" xmlns:xml="http://www.w3.org/XML/1998/namespace" xmlns:w10="http://schemas.microsoft.com/office/word/2010/wordml">
+<w:hdr xmlns="http://schemas.openxmlformats.org/wordprocessingml/2006/main" xmlns:a="http://schemas.openxmlformats.org/drawingml/2006/main" xmlns:m="http://schemas.openxmlformats.org/officeDocument/2006/math" xmlns:ma="http://schemas.openxmlformats.org/schemaLibrary/2006/main" xmlns:pic="http://schemas.openxmlformats.org/drawingml/2006/picture" xmlns:r="http://schemas.openxmlformats.org/officeDocument/2006/relationships" xmlns:s="http://schemas.openxmlformats.org/officeDocument/2006/sharedTypes" xmlns:w="http://schemas.openxmlformats.org/wordprocessingml/2006/main" xmlns:wp="http://schemas.openxmlformats.org/drawingml/2006/wordprocessingDrawing" xmlns:xml="http://www.w3.org/XML/1998/namespace">
   <w:p>
     <w:pPr>
       <w:tabs>
@@ -84,7 +84,7 @@
 </file>
 
 <file path=word/header2.xml><?xml version="1.0" encoding="utf-8"?>
-<w:hdr xmlns="http://schemas.openxmlformats.org/wordprocessingml/2006/main" xmlns:a="http://schemas.openxmlformats.org/drawingml/2006/main" xmlns:m="http://schemas.openxmlformats.org/officeDocument/2006/math" xmlns:ma="http://schemas.openxmlformats.org/schemaLibrary/2006/main" xmlns:pic="http://schemas.openxmlformats.org/drawingml/2006/picture" xmlns:r="http://schemas.openxmlformats.org/officeDocument/2006/relationships" xmlns:s="http://schemas.openxmlformats.org/officeDocument/2006/sharedTypes" xmlns:w="http://schemas.openxmlformats.org/wordprocessingml/2006/main" xmlns:wp="http://schemas.openxmlformats.org/drawingml/2006/wordprocessingDrawing" xmlns:xml="http://www.w3.org/XML/1998/namespace" xmlns:w10="http://schemas.microsoft.com/office/word/2010/wordml">
+<w:hdr xmlns="http://schemas.openxmlformats.org/wordprocessingml/2006/main" xmlns:a="http://schemas.openxmlformats.org/drawingml/2006/main" xmlns:m="http://schemas.openxmlformats.org/officeDocument/2006/math" xmlns:ma="http://schemas.openxmlformats.org/schemaLibrary/2006/main" xmlns:pic="http://schemas.openxmlformats.org/drawingml/2006/picture" xmlns:r="http://schemas.openxmlformats.org/officeDocument/2006/relationships" xmlns:s="http://schemas.openxmlformats.org/officeDocument/2006/sharedTypes" xmlns:w="http://schemas.openxmlformats.org/wordprocessingml/2006/main" xmlns:wp="http://schemas.openxmlformats.org/drawingml/2006/wordprocessingDrawing" xmlns:xml="http://www.w3.org/XML/1998/namespace">
   <w:p>
     <w:pPr>
       <w:tabs>

</xml_diff>